<commit_message>
Update N5 title to curiosity-gap formula: Why Losing Money Makes You Want to Lose More
https://claude.ai/code/session_01L4D3BJE5wxKGrRneu3Lana
</commit_message>
<xml_diff>
--- a/N5_Prepublish_Checklist.docx
+++ b/N5_Prepublish_Checklist.docx
@@ -83,7 +83,7 @@
           <w:color w:val="B02A2A"/>
           <w:sz w:val="22"/>
         </w:rPr>
-        <w:t>── 2. TÍTULO — pendiente score VidIQ ──</w:t>
+        <w:t>── 2. TÍTULO — curiosity gap · open loop · contradicción directa ──</w:t>
       </w:r>
     </w:p>
     <w:p>
@@ -103,7 +103,7 @@
           <w:color w:val="2C3E50"/>
           <w:sz w:val="24"/>
         </w:rPr>
-        <w:t>Your Brain Won't Let You Quit — And It's Costing You Everything</w:t>
+        <w:t>Why Losing Money Makes You Want to Lose More</w:t>
       </w:r>
     </w:p>
     <w:p>
@@ -116,7 +116,7 @@
           <w:color w:val="777777"/>
           <w:sz w:val="16"/>
         </w:rPr>
-        <w:t>Alternativas evaluadas:  'The $40,000 Mistake Your Brain Keeps Making'  |  'Why Your Brain Can't Stop Losing Money'</w:t>
+        <w:t>Mecanismo: contradicción pura en 9 palabras. El cerebro del viewer dice 'eso no puede ser verdad' → click obligatorio para resolver el loop.</w:t>
       </w:r>
     </w:p>
     <w:p>
@@ -129,7 +129,7 @@
           <w:color w:val="777777"/>
           <w:sz w:val="16"/>
         </w:rPr>
-        <w:t>Histórico canal:  N3 (V6) = 92/100  ·  N4 = ~90-94/100  →  mantener línea title psychology: curiosity gap + loss</w:t>
+        <w:t>Descartados:  'Your Brain Won't Let You Quit — And It's Costing You Everything' (demasiado largo, dos ideas, genérico)  |  'The $40,000 Mistake You're Probably Making Right Now'  |  'Why You Can't Sell Your Worst Investment'</w:t>
       </w:r>
     </w:p>
     <w:p>
@@ -142,7 +142,20 @@
           <w:color w:val="777777"/>
           <w:sz w:val="16"/>
         </w:rPr>
-        <w:t>Thumbnail text: 'YOUR BRAIN WON'T LET YOU QUIT' — coincide con título, refuerza el loop</w:t>
+        <w:t>Histórico canal:  N3 (V6) = 92/100  ·  N4 = ~90-94/100  →  este título prioriza CTR sobre VidIQ score (Zenn formula)</w:t>
+      </w:r>
+    </w:p>
+    <w:p>
+      <w:pPr>
+        <w:spacing w:before="20" w:after="20"/>
+      </w:pPr>
+      <w:r>
+        <w:rPr>
+          <w:b w:val="0"/>
+          <w:color w:val="777777"/>
+          <w:sz w:val="16"/>
+        </w:rPr>
+        <w:t>Thumbnail text: 'YOUR BRAIN WON'T LET YOU QUIT' — complementa el título, refuerza el loop visual</w:t>
       </w:r>
     </w:p>
     <w:p>
@@ -1042,7 +1055,7 @@
         <w:rPr>
           <w:sz w:val="20"/>
         </w:rPr>
-        <w:t>☐  Título:         Your Brain Won't Let You Quit — And It's Costing You Everything</w:t>
+        <w:t>☐  Título:         Why Losing Money Makes You Want to Lose More</w:t>
       </w:r>
     </w:p>
     <w:p>

</xml_diff>